<commit_message>
Add missing condition text
</commit_message>
<xml_diff>
--- a/arches_her/docx/Pre-App Recommend Condition Letter.docx
+++ b/arches_her/docx/Pre-App Recommend Condition Letter.docx
@@ -1,6 +1,6 @@
 
 <file path=word/document.xml><?xml version="1.0" encoding="utf-8"?>
-<w:document xmlns:wpc="http://schemas.microsoft.com/office/word/2010/wordprocessingCanvas" xmlns:cx="http://schemas.microsoft.com/office/drawing/2014/chartex" xmlns:cx1="http://schemas.microsoft.com/office/drawing/2015/9/8/chartex" xmlns:cx2="http://schemas.microsoft.com/office/drawing/2015/10/21/chartex" xmlns:cx3="http://schemas.microsoft.com/office/drawing/2016/5/9/chartex" xmlns:cx4="http://schemas.microsoft.com/office/drawing/2016/5/10/chartex" xmlns:cx5="http://schemas.microsoft.com/office/drawing/2016/5/11/chartex" xmlns:cx6="http://schemas.microsoft.com/office/drawing/2016/5/12/chartex" xmlns:cx7="http://schemas.microsoft.com/office/drawing/2016/5/13/chartex" xmlns:cx8="http://schemas.microsoft.com/office/drawing/2016/5/14/chartex" xmlns:mc="http://schemas.openxmlformats.org/markup-compatibility/2006" xmlns:aink="http://schemas.microsoft.com/office/drawing/2016/ink" xmlns:am3d="http://schemas.microsoft.com/office/drawing/2017/model3d" xmlns:o="urn:schemas-microsoft-com:office:office" xmlns:oel="http://schemas.microsoft.com/office/2019/extlst" xmlns:r="http://schemas.openxmlformats.org/officeDocument/2006/relationships" xmlns:m="http://schemas.openxmlformats.org/officeDocument/2006/math" xmlns:v="urn:schemas-microsoft-com:vml" xmlns:wp14="http://schemas.microsoft.com/office/word/2010/wordprocessingDrawing" xmlns:wp="http://schemas.openxmlformats.org/drawingml/2006/wordprocessingDrawing" xmlns:w10="urn:schemas-microsoft-com:office:word" xmlns:w="http://schemas.openxmlformats.org/wordprocessingml/2006/main" xmlns:w14="http://schemas.microsoft.com/office/word/2010/wordml" xmlns:w15="http://schemas.microsoft.com/office/word/2012/wordml" xmlns:w16cex="http://schemas.microsoft.com/office/word/2018/wordml/cex" xmlns:w16cid="http://schemas.microsoft.com/office/word/2016/wordml/cid" xmlns:w16="http://schemas.microsoft.com/office/word/2018/wordml" xmlns:w16du="http://schemas.microsoft.com/office/word/2023/wordml/word16du" xmlns:w16sdtdh="http://schemas.microsoft.com/office/word/2020/wordml/sdtdatahash" xmlns:w16sdtfl="http://schemas.microsoft.com/office/word/2024/wordml/sdtformatlock" xmlns:w16se="http://schemas.microsoft.com/office/word/2015/wordml/symex" xmlns:wpg="http://schemas.microsoft.com/office/word/2010/wordprocessingGroup" xmlns:wpi="http://schemas.microsoft.com/office/word/2010/wordprocessingInk" xmlns:wne="http://schemas.microsoft.com/office/word/2006/wordml" xmlns:wps="http://schemas.microsoft.com/office/word/2010/wordprocessingShape" mc:Ignorable="w14 w15 w16se w16cid w16 w16cex w16sdtdh w16sdtfl w16du wp14">
+<w:document xmlns:wpc="http://schemas.microsoft.com/office/word/2010/wordprocessingCanvas" xmlns:cx="http://schemas.microsoft.com/office/drawing/2014/chartex" xmlns:cx1="http://schemas.microsoft.com/office/drawing/2015/9/8/chartex" xmlns:cx2="http://schemas.microsoft.com/office/drawing/2015/10/21/chartex" xmlns:cx3="http://schemas.microsoft.com/office/drawing/2016/5/9/chartex" xmlns:cx4="http://schemas.microsoft.com/office/drawing/2016/5/10/chartex" xmlns:cx5="http://schemas.microsoft.com/office/drawing/2016/5/11/chartex" xmlns:cx6="http://schemas.microsoft.com/office/drawing/2016/5/12/chartex" xmlns:cx7="http://schemas.microsoft.com/office/drawing/2016/5/13/chartex" xmlns:cx8="http://schemas.microsoft.com/office/drawing/2016/5/14/chartex" xmlns:mc="http://schemas.openxmlformats.org/markup-compatibility/2006" xmlns:aink="http://schemas.microsoft.com/office/drawing/2016/ink" xmlns:am3d="http://schemas.microsoft.com/office/drawing/2017/model3d" xmlns:o="urn:schemas-microsoft-com:office:office" xmlns:oel="http://schemas.microsoft.com/office/2019/extlst" xmlns:r="http://schemas.openxmlformats.org/officeDocument/2006/relationships" xmlns:m="http://schemas.openxmlformats.org/officeDocument/2006/math" xmlns:v="urn:schemas-microsoft-com:vml" xmlns:wp14="http://schemas.microsoft.com/office/word/2010/wordprocessingDrawing" xmlns:wp="http://schemas.openxmlformats.org/drawingml/2006/wordprocessingDrawing" xmlns:w10="urn:schemas-microsoft-com:office:word" xmlns:w="http://schemas.openxmlformats.org/wordprocessingml/2006/main" xmlns:w14="http://schemas.microsoft.com/office/word/2010/wordml" xmlns:w15="http://schemas.microsoft.com/office/word/2012/wordml" xmlns:w16cei="http://schemas.microsoft.com/office/word/2026/wordml/cei" xmlns:w16cex="http://schemas.microsoft.com/office/word/2018/wordml/cex" xmlns:w16cid="http://schemas.microsoft.com/office/word/2016/wordml/cid" xmlns:w16="http://schemas.microsoft.com/office/word/2018/wordml" xmlns:w16du="http://schemas.microsoft.com/office/word/2023/wordml/word16du" xmlns:w16sdtdh="http://schemas.microsoft.com/office/word/2020/wordml/sdtdatahash" xmlns:w16sdtfl="http://schemas.microsoft.com/office/word/2024/wordml/sdtformatlock" xmlns:w16se="http://schemas.microsoft.com/office/word/2015/wordml/symex" xmlns:wpg="http://schemas.microsoft.com/office/word/2010/wordprocessingGroup" xmlns:wpi="http://schemas.microsoft.com/office/word/2010/wordprocessingInk" xmlns:wne="http://schemas.microsoft.com/office/word/2006/wordml" xmlns:wps="http://schemas.microsoft.com/office/word/2010/wordprocessingShape" mc:Ignorable="w14 w15 w16se w16cid w16 w16cex w16sdtdh w16sdtfl w16du wp14">
   <w:body>
     <w:tbl>
       <w:tblPr>
@@ -887,6 +887,48 @@
         <w:rPr>
           <w:rFonts w:cstheme="minorHAnsi"/>
         </w:rPr>
+        <w:t xml:space="preserve">Pre-commencement conditions are necessary to safeguard the archaeological interest on sites. Approval of a WSI before works begin on site provides clarity on what investigations are required, and their timing in relation to the development programme. If the applicant does not agree to a pre-commencement </w:t>
+      </w:r>
+      <w:proofErr w:type="gramStart"/>
+      <w:r>
+        <w:rPr>
+          <w:rFonts w:cstheme="minorHAnsi"/>
+        </w:rPr>
+        <w:t>condition</w:t>
+      </w:r>
+      <w:proofErr w:type="gramEnd"/>
+      <w:r>
+        <w:rPr>
+          <w:rFonts w:cstheme="minorHAnsi"/>
+        </w:rPr>
+        <w:t xml:space="preserve"> please let us know their reasons and any alternatives suggested. Without the recommended pre-commencement condition(s) being imposed the application should be refused as it would not comply with NPPF paragraph 218.</w:t>
+      </w:r>
+    </w:p>
+    <w:p>
+      <w:pPr>
+        <w:tabs>
+          <w:tab w:val="left" w:pos="5245"/>
+        </w:tabs>
+        <w:spacing w:after="0" w:line="240" w:lineRule="auto"/>
+        <w:rPr>
+          <w:rFonts w:cstheme="minorHAnsi"/>
+        </w:rPr>
+      </w:pPr>
+    </w:p>
+    <w:p>
+      <w:pPr>
+        <w:tabs>
+          <w:tab w:val="left" w:pos="5245"/>
+        </w:tabs>
+        <w:spacing w:after="0" w:line="240" w:lineRule="auto"/>
+        <w:rPr>
+          <w:rFonts w:cstheme="minorHAnsi"/>
+        </w:rPr>
+      </w:pPr>
+      <w:r>
+        <w:rPr>
+          <w:rFonts w:cstheme="minorHAnsi"/>
+        </w:rPr>
         <w:t>The archaeological work secured by the condition would include:</w:t>
       </w:r>
     </w:p>
@@ -977,7 +1019,21 @@
         <w:rPr>
           <w:rFonts w:cstheme="minorHAnsi"/>
         </w:rPr>
-        <w:t>This Initial Pre-application advice relates solely to archaeological considerations, is provided without prejudice to the local authority’s decision-making role, and may be shared with the local authority on whose behalf it is given.  You should also consult Historic England’s Development Advice team on statutory matters.</w:t>
+        <w:t xml:space="preserve">This Initial Pre-application advice relates solely to archaeological considerations, is provided without prejudice to the local authority’s decision-making </w:t>
+      </w:r>
+      <w:proofErr w:type="gramStart"/>
+      <w:r>
+        <w:rPr>
+          <w:rFonts w:cstheme="minorHAnsi"/>
+        </w:rPr>
+        <w:t>role, and</w:t>
+      </w:r>
+      <w:proofErr w:type="gramEnd"/>
+      <w:r>
+        <w:rPr>
+          <w:rFonts w:cstheme="minorHAnsi"/>
+        </w:rPr>
+        <w:t xml:space="preserve"> may be shared with the local authority on whose behalf it is given.  You should also consult Historic England’s Development Advice team on statutory matters.</w:t>
       </w:r>
     </w:p>
     <w:p>
@@ -1065,6 +1121,7 @@
           <w:b/>
           <w:bCs/>
         </w:rPr>
+        <w:lastRenderedPageBreak/>
         <w:t>&lt;Casework Officer&gt;</w:t>
       </w:r>
     </w:p>
@@ -1127,7 +1184,21 @@
         <w:rPr>
           <w:rFonts w:cstheme="minorHAnsi"/>
         </w:rPr>
-        <w:t>London and South East Region</w:t>
+        <w:t xml:space="preserve">London and </w:t>
+      </w:r>
+      <w:proofErr w:type="gramStart"/>
+      <w:r>
+        <w:rPr>
+          <w:rFonts w:cstheme="minorHAnsi"/>
+        </w:rPr>
+        <w:t>South East</w:t>
+      </w:r>
+      <w:proofErr w:type="gramEnd"/>
+      <w:r>
+        <w:rPr>
+          <w:rFonts w:cstheme="minorHAnsi"/>
+        </w:rPr>
+        <w:t xml:space="preserve"> Region</w:t>
       </w:r>
     </w:p>
     <w:p>
@@ -1158,7 +1229,7 @@
 </file>
 
 <file path=word/endnotes.xml><?xml version="1.0" encoding="utf-8"?>
-<w:endnotes xmlns:wpc="http://schemas.microsoft.com/office/word/2010/wordprocessingCanvas" xmlns:cx="http://schemas.microsoft.com/office/drawing/2014/chartex" xmlns:cx1="http://schemas.microsoft.com/office/drawing/2015/9/8/chartex" xmlns:cx2="http://schemas.microsoft.com/office/drawing/2015/10/21/chartex" xmlns:cx3="http://schemas.microsoft.com/office/drawing/2016/5/9/chartex" xmlns:cx4="http://schemas.microsoft.com/office/drawing/2016/5/10/chartex" xmlns:cx5="http://schemas.microsoft.com/office/drawing/2016/5/11/chartex" xmlns:cx6="http://schemas.microsoft.com/office/drawing/2016/5/12/chartex" xmlns:cx7="http://schemas.microsoft.com/office/drawing/2016/5/13/chartex" xmlns:cx8="http://schemas.microsoft.com/office/drawing/2016/5/14/chartex" xmlns:mc="http://schemas.openxmlformats.org/markup-compatibility/2006" xmlns:aink="http://schemas.microsoft.com/office/drawing/2016/ink" xmlns:am3d="http://schemas.microsoft.com/office/drawing/2017/model3d" xmlns:o="urn:schemas-microsoft-com:office:office" xmlns:oel="http://schemas.microsoft.com/office/2019/extlst" xmlns:r="http://schemas.openxmlformats.org/officeDocument/2006/relationships" xmlns:m="http://schemas.openxmlformats.org/officeDocument/2006/math" xmlns:v="urn:schemas-microsoft-com:vml" xmlns:wp14="http://schemas.microsoft.com/office/word/2010/wordprocessingDrawing" xmlns:wp="http://schemas.openxmlformats.org/drawingml/2006/wordprocessingDrawing" xmlns:w10="urn:schemas-microsoft-com:office:word" xmlns:w="http://schemas.openxmlformats.org/wordprocessingml/2006/main" xmlns:w14="http://schemas.microsoft.com/office/word/2010/wordml" xmlns:w15="http://schemas.microsoft.com/office/word/2012/wordml" xmlns:w16cex="http://schemas.microsoft.com/office/word/2018/wordml/cex" xmlns:w16cid="http://schemas.microsoft.com/office/word/2016/wordml/cid" xmlns:w16="http://schemas.microsoft.com/office/word/2018/wordml" xmlns:w16du="http://schemas.microsoft.com/office/word/2023/wordml/word16du" xmlns:w16sdtdh="http://schemas.microsoft.com/office/word/2020/wordml/sdtdatahash" xmlns:w16sdtfl="http://schemas.microsoft.com/office/word/2024/wordml/sdtformatlock" xmlns:w16se="http://schemas.microsoft.com/office/word/2015/wordml/symex" xmlns:wpg="http://schemas.microsoft.com/office/word/2010/wordprocessingGroup" xmlns:wpi="http://schemas.microsoft.com/office/word/2010/wordprocessingInk" xmlns:wne="http://schemas.microsoft.com/office/word/2006/wordml" xmlns:wps="http://schemas.microsoft.com/office/word/2010/wordprocessingShape" mc:Ignorable="w14 w15 w16se w16cid w16 w16cex w16sdtdh w16sdtfl w16du wp14">
+<w:endnotes xmlns:wpc="http://schemas.microsoft.com/office/word/2010/wordprocessingCanvas" xmlns:cx="http://schemas.microsoft.com/office/drawing/2014/chartex" xmlns:cx1="http://schemas.microsoft.com/office/drawing/2015/9/8/chartex" xmlns:cx2="http://schemas.microsoft.com/office/drawing/2015/10/21/chartex" xmlns:cx3="http://schemas.microsoft.com/office/drawing/2016/5/9/chartex" xmlns:cx4="http://schemas.microsoft.com/office/drawing/2016/5/10/chartex" xmlns:cx5="http://schemas.microsoft.com/office/drawing/2016/5/11/chartex" xmlns:cx6="http://schemas.microsoft.com/office/drawing/2016/5/12/chartex" xmlns:cx7="http://schemas.microsoft.com/office/drawing/2016/5/13/chartex" xmlns:cx8="http://schemas.microsoft.com/office/drawing/2016/5/14/chartex" xmlns:mc="http://schemas.openxmlformats.org/markup-compatibility/2006" xmlns:aink="http://schemas.microsoft.com/office/drawing/2016/ink" xmlns:am3d="http://schemas.microsoft.com/office/drawing/2017/model3d" xmlns:o="urn:schemas-microsoft-com:office:office" xmlns:oel="http://schemas.microsoft.com/office/2019/extlst" xmlns:r="http://schemas.openxmlformats.org/officeDocument/2006/relationships" xmlns:m="http://schemas.openxmlformats.org/officeDocument/2006/math" xmlns:v="urn:schemas-microsoft-com:vml" xmlns:wp14="http://schemas.microsoft.com/office/word/2010/wordprocessingDrawing" xmlns:wp="http://schemas.openxmlformats.org/drawingml/2006/wordprocessingDrawing" xmlns:w10="urn:schemas-microsoft-com:office:word" xmlns:w="http://schemas.openxmlformats.org/wordprocessingml/2006/main" xmlns:w14="http://schemas.microsoft.com/office/word/2010/wordml" xmlns:w15="http://schemas.microsoft.com/office/word/2012/wordml" xmlns:w16cei="http://schemas.microsoft.com/office/word/2026/wordml/cei" xmlns:w16cex="http://schemas.microsoft.com/office/word/2018/wordml/cex" xmlns:w16cid="http://schemas.microsoft.com/office/word/2016/wordml/cid" xmlns:w16="http://schemas.microsoft.com/office/word/2018/wordml" xmlns:w16du="http://schemas.microsoft.com/office/word/2023/wordml/word16du" xmlns:w16sdtdh="http://schemas.microsoft.com/office/word/2020/wordml/sdtdatahash" xmlns:w16sdtfl="http://schemas.microsoft.com/office/word/2024/wordml/sdtformatlock" xmlns:w16se="http://schemas.microsoft.com/office/word/2015/wordml/symex" xmlns:wpg="http://schemas.microsoft.com/office/word/2010/wordprocessingGroup" xmlns:wpi="http://schemas.microsoft.com/office/word/2010/wordprocessingInk" xmlns:wne="http://schemas.microsoft.com/office/word/2006/wordml" xmlns:wps="http://schemas.microsoft.com/office/word/2010/wordprocessingShape" mc:Ignorable="w14 w15 w16se w16cid w16 w16cex w16sdtdh w16sdtfl w16du wp14">
   <w:endnote w:type="separator" w:id="-1">
     <w:p>
       <w:pPr>
@@ -1183,7 +1254,7 @@
 </file>
 
 <file path=word/footer1.xml><?xml version="1.0" encoding="utf-8"?>
-<w:ftr xmlns:wpc="http://schemas.microsoft.com/office/word/2010/wordprocessingCanvas" xmlns:cx="http://schemas.microsoft.com/office/drawing/2014/chartex" xmlns:cx1="http://schemas.microsoft.com/office/drawing/2015/9/8/chartex" xmlns:cx2="http://schemas.microsoft.com/office/drawing/2015/10/21/chartex" xmlns:cx3="http://schemas.microsoft.com/office/drawing/2016/5/9/chartex" xmlns:cx4="http://schemas.microsoft.com/office/drawing/2016/5/10/chartex" xmlns:cx5="http://schemas.microsoft.com/office/drawing/2016/5/11/chartex" xmlns:cx6="http://schemas.microsoft.com/office/drawing/2016/5/12/chartex" xmlns:cx7="http://schemas.microsoft.com/office/drawing/2016/5/13/chartex" xmlns:cx8="http://schemas.microsoft.com/office/drawing/2016/5/14/chartex" xmlns:mc="http://schemas.openxmlformats.org/markup-compatibility/2006" xmlns:aink="http://schemas.microsoft.com/office/drawing/2016/ink" xmlns:am3d="http://schemas.microsoft.com/office/drawing/2017/model3d" xmlns:o="urn:schemas-microsoft-com:office:office" xmlns:oel="http://schemas.microsoft.com/office/2019/extlst" xmlns:r="http://schemas.openxmlformats.org/officeDocument/2006/relationships" xmlns:m="http://schemas.openxmlformats.org/officeDocument/2006/math" xmlns:v="urn:schemas-microsoft-com:vml" xmlns:wp14="http://schemas.microsoft.com/office/word/2010/wordprocessingDrawing" xmlns:wp="http://schemas.openxmlformats.org/drawingml/2006/wordprocessingDrawing" xmlns:w10="urn:schemas-microsoft-com:office:word" xmlns:w="http://schemas.openxmlformats.org/wordprocessingml/2006/main" xmlns:w14="http://schemas.microsoft.com/office/word/2010/wordml" xmlns:w15="http://schemas.microsoft.com/office/word/2012/wordml" xmlns:w16cex="http://schemas.microsoft.com/office/word/2018/wordml/cex" xmlns:w16cid="http://schemas.microsoft.com/office/word/2016/wordml/cid" xmlns:w16="http://schemas.microsoft.com/office/word/2018/wordml" xmlns:w16du="http://schemas.microsoft.com/office/word/2023/wordml/word16du" xmlns:w16sdtdh="http://schemas.microsoft.com/office/word/2020/wordml/sdtdatahash" xmlns:w16sdtfl="http://schemas.microsoft.com/office/word/2024/wordml/sdtformatlock" xmlns:w16se="http://schemas.microsoft.com/office/word/2015/wordml/symex" xmlns:wpg="http://schemas.microsoft.com/office/word/2010/wordprocessingGroup" xmlns:wpi="http://schemas.microsoft.com/office/word/2010/wordprocessingInk" xmlns:wne="http://schemas.microsoft.com/office/word/2006/wordml" xmlns:wps="http://schemas.microsoft.com/office/word/2010/wordprocessingShape" mc:Ignorable="w14 w15 w16se w16cid w16 w16cex w16sdtdh w16sdtfl w16du wp14">
+<w:ftr xmlns:wpc="http://schemas.microsoft.com/office/word/2010/wordprocessingCanvas" xmlns:cx="http://schemas.microsoft.com/office/drawing/2014/chartex" xmlns:cx1="http://schemas.microsoft.com/office/drawing/2015/9/8/chartex" xmlns:cx2="http://schemas.microsoft.com/office/drawing/2015/10/21/chartex" xmlns:cx3="http://schemas.microsoft.com/office/drawing/2016/5/9/chartex" xmlns:cx4="http://schemas.microsoft.com/office/drawing/2016/5/10/chartex" xmlns:cx5="http://schemas.microsoft.com/office/drawing/2016/5/11/chartex" xmlns:cx6="http://schemas.microsoft.com/office/drawing/2016/5/12/chartex" xmlns:cx7="http://schemas.microsoft.com/office/drawing/2016/5/13/chartex" xmlns:cx8="http://schemas.microsoft.com/office/drawing/2016/5/14/chartex" xmlns:mc="http://schemas.openxmlformats.org/markup-compatibility/2006" xmlns:aink="http://schemas.microsoft.com/office/drawing/2016/ink" xmlns:am3d="http://schemas.microsoft.com/office/drawing/2017/model3d" xmlns:o="urn:schemas-microsoft-com:office:office" xmlns:oel="http://schemas.microsoft.com/office/2019/extlst" xmlns:r="http://schemas.openxmlformats.org/officeDocument/2006/relationships" xmlns:m="http://schemas.openxmlformats.org/officeDocument/2006/math" xmlns:v="urn:schemas-microsoft-com:vml" xmlns:wp14="http://schemas.microsoft.com/office/word/2010/wordprocessingDrawing" xmlns:wp="http://schemas.openxmlformats.org/drawingml/2006/wordprocessingDrawing" xmlns:w10="urn:schemas-microsoft-com:office:word" xmlns:w="http://schemas.openxmlformats.org/wordprocessingml/2006/main" xmlns:w14="http://schemas.microsoft.com/office/word/2010/wordml" xmlns:w15="http://schemas.microsoft.com/office/word/2012/wordml" xmlns:w16cei="http://schemas.microsoft.com/office/word/2026/wordml/cei" xmlns:w16cex="http://schemas.microsoft.com/office/word/2018/wordml/cex" xmlns:w16cid="http://schemas.microsoft.com/office/word/2016/wordml/cid" xmlns:w16="http://schemas.microsoft.com/office/word/2018/wordml" xmlns:w16du="http://schemas.microsoft.com/office/word/2023/wordml/word16du" xmlns:w16sdtdh="http://schemas.microsoft.com/office/word/2020/wordml/sdtdatahash" xmlns:w16sdtfl="http://schemas.microsoft.com/office/word/2024/wordml/sdtformatlock" xmlns:w16se="http://schemas.microsoft.com/office/word/2015/wordml/symex" xmlns:wpg="http://schemas.microsoft.com/office/word/2010/wordprocessingGroup" xmlns:wpi="http://schemas.microsoft.com/office/word/2010/wordprocessingInk" xmlns:wne="http://schemas.microsoft.com/office/word/2006/wordml" xmlns:wps="http://schemas.microsoft.com/office/word/2010/wordprocessingShape" mc:Ignorable="w14 w15 w16se w16cid w16 w16cex w16sdtdh w16sdtfl w16du wp14">
   <w:p>
     <w:pPr>
       <w:pStyle w:val="Footer"/>
@@ -1193,7 +1264,7 @@
 </file>
 
 <file path=word/footer2.xml><?xml version="1.0" encoding="utf-8"?>
-<w:ftr xmlns:wpc="http://schemas.microsoft.com/office/word/2010/wordprocessingCanvas" xmlns:cx="http://schemas.microsoft.com/office/drawing/2014/chartex" xmlns:cx1="http://schemas.microsoft.com/office/drawing/2015/9/8/chartex" xmlns:cx2="http://schemas.microsoft.com/office/drawing/2015/10/21/chartex" xmlns:cx3="http://schemas.microsoft.com/office/drawing/2016/5/9/chartex" xmlns:cx4="http://schemas.microsoft.com/office/drawing/2016/5/10/chartex" xmlns:cx5="http://schemas.microsoft.com/office/drawing/2016/5/11/chartex" xmlns:cx6="http://schemas.microsoft.com/office/drawing/2016/5/12/chartex" xmlns:cx7="http://schemas.microsoft.com/office/drawing/2016/5/13/chartex" xmlns:cx8="http://schemas.microsoft.com/office/drawing/2016/5/14/chartex" xmlns:mc="http://schemas.openxmlformats.org/markup-compatibility/2006" xmlns:aink="http://schemas.microsoft.com/office/drawing/2016/ink" xmlns:am3d="http://schemas.microsoft.com/office/drawing/2017/model3d" xmlns:o="urn:schemas-microsoft-com:office:office" xmlns:oel="http://schemas.microsoft.com/office/2019/extlst" xmlns:r="http://schemas.openxmlformats.org/officeDocument/2006/relationships" xmlns:m="http://schemas.openxmlformats.org/officeDocument/2006/math" xmlns:v="urn:schemas-microsoft-com:vml" xmlns:wp14="http://schemas.microsoft.com/office/word/2010/wordprocessingDrawing" xmlns:wp="http://schemas.openxmlformats.org/drawingml/2006/wordprocessingDrawing" xmlns:w10="urn:schemas-microsoft-com:office:word" xmlns:w="http://schemas.openxmlformats.org/wordprocessingml/2006/main" xmlns:w14="http://schemas.microsoft.com/office/word/2010/wordml" xmlns:w15="http://schemas.microsoft.com/office/word/2012/wordml" xmlns:w16cex="http://schemas.microsoft.com/office/word/2018/wordml/cex" xmlns:w16cid="http://schemas.microsoft.com/office/word/2016/wordml/cid" xmlns:w16="http://schemas.microsoft.com/office/word/2018/wordml" xmlns:w16du="http://schemas.microsoft.com/office/word/2023/wordml/word16du" xmlns:w16sdtdh="http://schemas.microsoft.com/office/word/2020/wordml/sdtdatahash" xmlns:w16sdtfl="http://schemas.microsoft.com/office/word/2024/wordml/sdtformatlock" xmlns:w16se="http://schemas.microsoft.com/office/word/2015/wordml/symex" xmlns:wpg="http://schemas.microsoft.com/office/word/2010/wordprocessingGroup" xmlns:wpi="http://schemas.microsoft.com/office/word/2010/wordprocessingInk" xmlns:wne="http://schemas.microsoft.com/office/word/2006/wordml" xmlns:wps="http://schemas.microsoft.com/office/word/2010/wordprocessingShape" mc:Ignorable="w14 w15 w16se w16cid w16 w16cex w16sdtdh w16sdtfl w16du wp14">
+<w:ftr xmlns:wpc="http://schemas.microsoft.com/office/word/2010/wordprocessingCanvas" xmlns:cx="http://schemas.microsoft.com/office/drawing/2014/chartex" xmlns:cx1="http://schemas.microsoft.com/office/drawing/2015/9/8/chartex" xmlns:cx2="http://schemas.microsoft.com/office/drawing/2015/10/21/chartex" xmlns:cx3="http://schemas.microsoft.com/office/drawing/2016/5/9/chartex" xmlns:cx4="http://schemas.microsoft.com/office/drawing/2016/5/10/chartex" xmlns:cx5="http://schemas.microsoft.com/office/drawing/2016/5/11/chartex" xmlns:cx6="http://schemas.microsoft.com/office/drawing/2016/5/12/chartex" xmlns:cx7="http://schemas.microsoft.com/office/drawing/2016/5/13/chartex" xmlns:cx8="http://schemas.microsoft.com/office/drawing/2016/5/14/chartex" xmlns:mc="http://schemas.openxmlformats.org/markup-compatibility/2006" xmlns:aink="http://schemas.microsoft.com/office/drawing/2016/ink" xmlns:am3d="http://schemas.microsoft.com/office/drawing/2017/model3d" xmlns:o="urn:schemas-microsoft-com:office:office" xmlns:oel="http://schemas.microsoft.com/office/2019/extlst" xmlns:r="http://schemas.openxmlformats.org/officeDocument/2006/relationships" xmlns:m="http://schemas.openxmlformats.org/officeDocument/2006/math" xmlns:v="urn:schemas-microsoft-com:vml" xmlns:wp14="http://schemas.microsoft.com/office/word/2010/wordprocessingDrawing" xmlns:wp="http://schemas.openxmlformats.org/drawingml/2006/wordprocessingDrawing" xmlns:w10="urn:schemas-microsoft-com:office:word" xmlns:w="http://schemas.openxmlformats.org/wordprocessingml/2006/main" xmlns:w14="http://schemas.microsoft.com/office/word/2010/wordml" xmlns:w15="http://schemas.microsoft.com/office/word/2012/wordml" xmlns:w16cei="http://schemas.microsoft.com/office/word/2026/wordml/cei" xmlns:w16cex="http://schemas.microsoft.com/office/word/2018/wordml/cex" xmlns:w16cid="http://schemas.microsoft.com/office/word/2016/wordml/cid" xmlns:w16="http://schemas.microsoft.com/office/word/2018/wordml" xmlns:w16du="http://schemas.microsoft.com/office/word/2023/wordml/word16du" xmlns:w16sdtdh="http://schemas.microsoft.com/office/word/2020/wordml/sdtdatahash" xmlns:w16sdtfl="http://schemas.microsoft.com/office/word/2024/wordml/sdtformatlock" xmlns:w16se="http://schemas.microsoft.com/office/word/2015/wordml/symex" xmlns:wpg="http://schemas.microsoft.com/office/word/2010/wordprocessingGroup" xmlns:wpi="http://schemas.microsoft.com/office/word/2010/wordprocessingInk" xmlns:wne="http://schemas.microsoft.com/office/word/2006/wordml" xmlns:wps="http://schemas.microsoft.com/office/word/2010/wordprocessingShape" mc:Ignorable="w14 w15 w16se w16cid w16 w16cex w16sdtdh w16sdtfl w16du wp14">
   <w:p>
     <w:pPr>
       <w:pStyle w:val="Footer"/>
@@ -1382,8 +1453,9 @@
         <w:sz w:val="16"/>
         <w:szCs w:val="16"/>
       </w:rPr>
-      <w:t>Historic England, 4th Floor, Cannon Bridge House, 25 Dowgate Hill, London EC4R 2YA</w:t>
+      <w:t xml:space="preserve">Historic England, 4th Floor, Cannon Bridge House, 25 </w:t>
     </w:r>
+    <w:proofErr w:type="spellStart"/>
     <w:r>
       <w:rPr>
         <w:rFonts w:ascii="Arial" w:hAnsi="Arial"/>
@@ -1392,6 +1464,27 @@
         <w:sz w:val="16"/>
         <w:szCs w:val="16"/>
       </w:rPr>
+      <w:t>Dowgate</w:t>
+    </w:r>
+    <w:proofErr w:type="spellEnd"/>
+    <w:r>
+      <w:rPr>
+        <w:rFonts w:ascii="Arial" w:hAnsi="Arial"/>
+        <w:b/>
+        <w:bCs/>
+        <w:sz w:val="16"/>
+        <w:szCs w:val="16"/>
+      </w:rPr>
+      <w:t xml:space="preserve"> Hill, London EC4R 2YA</w:t>
+    </w:r>
+    <w:r>
+      <w:rPr>
+        <w:rFonts w:ascii="Arial" w:hAnsi="Arial"/>
+        <w:b/>
+        <w:bCs/>
+        <w:sz w:val="16"/>
+        <w:szCs w:val="16"/>
+      </w:rPr>
       <w:br/>
     </w:r>
     <w:r>
@@ -1408,14 +1501,23 @@
         <w:sz w:val="16"/>
         <w:szCs w:val="16"/>
       </w:rPr>
-      <w:t>020 7973 3700</w:t>
+      <w:t xml:space="preserve">020 7973 </w:t>
     </w:r>
+    <w:proofErr w:type="gramStart"/>
     <w:r>
       <w:rPr>
         <w:rFonts w:ascii="Arial" w:hAnsi="Arial"/>
         <w:sz w:val="16"/>
         <w:szCs w:val="16"/>
       </w:rPr>
+      <w:t>3700</w:t>
+    </w:r>
+    <w:r>
+      <w:rPr>
+        <w:rFonts w:ascii="Arial" w:hAnsi="Arial"/>
+        <w:sz w:val="16"/>
+        <w:szCs w:val="16"/>
+      </w:rPr>
       <w:t xml:space="preserve">  </w:t>
     </w:r>
     <w:r>
@@ -1424,7 +1526,16 @@
         <w:sz w:val="16"/>
         <w:szCs w:val="16"/>
       </w:rPr>
-      <w:t xml:space="preserve">|  </w:t>
+      <w:t>|</w:t>
+    </w:r>
+    <w:proofErr w:type="gramEnd"/>
+    <w:r>
+      <w:rPr>
+        <w:rFonts w:ascii="Arial" w:hAnsi="Arial"/>
+        <w:sz w:val="16"/>
+        <w:szCs w:val="16"/>
+      </w:rPr>
+      <w:t xml:space="preserve">  </w:t>
     </w:r>
     <w:r>
       <w:rPr>
@@ -1499,7 +1610,7 @@
 </file>
 
 <file path=word/footer3.xml><?xml version="1.0" encoding="utf-8"?>
-<w:ftr xmlns:wpc="http://schemas.microsoft.com/office/word/2010/wordprocessingCanvas" xmlns:cx="http://schemas.microsoft.com/office/drawing/2014/chartex" xmlns:cx1="http://schemas.microsoft.com/office/drawing/2015/9/8/chartex" xmlns:cx2="http://schemas.microsoft.com/office/drawing/2015/10/21/chartex" xmlns:cx3="http://schemas.microsoft.com/office/drawing/2016/5/9/chartex" xmlns:cx4="http://schemas.microsoft.com/office/drawing/2016/5/10/chartex" xmlns:cx5="http://schemas.microsoft.com/office/drawing/2016/5/11/chartex" xmlns:cx6="http://schemas.microsoft.com/office/drawing/2016/5/12/chartex" xmlns:cx7="http://schemas.microsoft.com/office/drawing/2016/5/13/chartex" xmlns:cx8="http://schemas.microsoft.com/office/drawing/2016/5/14/chartex" xmlns:mc="http://schemas.openxmlformats.org/markup-compatibility/2006" xmlns:aink="http://schemas.microsoft.com/office/drawing/2016/ink" xmlns:am3d="http://schemas.microsoft.com/office/drawing/2017/model3d" xmlns:o="urn:schemas-microsoft-com:office:office" xmlns:oel="http://schemas.microsoft.com/office/2019/extlst" xmlns:r="http://schemas.openxmlformats.org/officeDocument/2006/relationships" xmlns:m="http://schemas.openxmlformats.org/officeDocument/2006/math" xmlns:v="urn:schemas-microsoft-com:vml" xmlns:wp14="http://schemas.microsoft.com/office/word/2010/wordprocessingDrawing" xmlns:wp="http://schemas.openxmlformats.org/drawingml/2006/wordprocessingDrawing" xmlns:w10="urn:schemas-microsoft-com:office:word" xmlns:w="http://schemas.openxmlformats.org/wordprocessingml/2006/main" xmlns:w14="http://schemas.microsoft.com/office/word/2010/wordml" xmlns:w15="http://schemas.microsoft.com/office/word/2012/wordml" xmlns:w16cex="http://schemas.microsoft.com/office/word/2018/wordml/cex" xmlns:w16cid="http://schemas.microsoft.com/office/word/2016/wordml/cid" xmlns:w16="http://schemas.microsoft.com/office/word/2018/wordml" xmlns:w16du="http://schemas.microsoft.com/office/word/2023/wordml/word16du" xmlns:w16sdtdh="http://schemas.microsoft.com/office/word/2020/wordml/sdtdatahash" xmlns:w16sdtfl="http://schemas.microsoft.com/office/word/2024/wordml/sdtformatlock" xmlns:w16se="http://schemas.microsoft.com/office/word/2015/wordml/symex" xmlns:wpg="http://schemas.microsoft.com/office/word/2010/wordprocessingGroup" xmlns:wpi="http://schemas.microsoft.com/office/word/2010/wordprocessingInk" xmlns:wne="http://schemas.microsoft.com/office/word/2006/wordml" xmlns:wps="http://schemas.microsoft.com/office/word/2010/wordprocessingShape" mc:Ignorable="w14 w15 w16se w16cid w16 w16cex w16sdtdh w16sdtfl w16du wp14">
+<w:ftr xmlns:wpc="http://schemas.microsoft.com/office/word/2010/wordprocessingCanvas" xmlns:cx="http://schemas.microsoft.com/office/drawing/2014/chartex" xmlns:cx1="http://schemas.microsoft.com/office/drawing/2015/9/8/chartex" xmlns:cx2="http://schemas.microsoft.com/office/drawing/2015/10/21/chartex" xmlns:cx3="http://schemas.microsoft.com/office/drawing/2016/5/9/chartex" xmlns:cx4="http://schemas.microsoft.com/office/drawing/2016/5/10/chartex" xmlns:cx5="http://schemas.microsoft.com/office/drawing/2016/5/11/chartex" xmlns:cx6="http://schemas.microsoft.com/office/drawing/2016/5/12/chartex" xmlns:cx7="http://schemas.microsoft.com/office/drawing/2016/5/13/chartex" xmlns:cx8="http://schemas.microsoft.com/office/drawing/2016/5/14/chartex" xmlns:mc="http://schemas.openxmlformats.org/markup-compatibility/2006" xmlns:aink="http://schemas.microsoft.com/office/drawing/2016/ink" xmlns:am3d="http://schemas.microsoft.com/office/drawing/2017/model3d" xmlns:o="urn:schemas-microsoft-com:office:office" xmlns:oel="http://schemas.microsoft.com/office/2019/extlst" xmlns:r="http://schemas.openxmlformats.org/officeDocument/2006/relationships" xmlns:m="http://schemas.openxmlformats.org/officeDocument/2006/math" xmlns:v="urn:schemas-microsoft-com:vml" xmlns:wp14="http://schemas.microsoft.com/office/word/2010/wordprocessingDrawing" xmlns:wp="http://schemas.openxmlformats.org/drawingml/2006/wordprocessingDrawing" xmlns:w10="urn:schemas-microsoft-com:office:word" xmlns:w="http://schemas.openxmlformats.org/wordprocessingml/2006/main" xmlns:w14="http://schemas.microsoft.com/office/word/2010/wordml" xmlns:w15="http://schemas.microsoft.com/office/word/2012/wordml" xmlns:w16cei="http://schemas.microsoft.com/office/word/2026/wordml/cei" xmlns:w16cex="http://schemas.microsoft.com/office/word/2018/wordml/cex" xmlns:w16cid="http://schemas.microsoft.com/office/word/2016/wordml/cid" xmlns:w16="http://schemas.microsoft.com/office/word/2018/wordml" xmlns:w16du="http://schemas.microsoft.com/office/word/2023/wordml/word16du" xmlns:w16sdtdh="http://schemas.microsoft.com/office/word/2020/wordml/sdtdatahash" xmlns:w16sdtfl="http://schemas.microsoft.com/office/word/2024/wordml/sdtformatlock" xmlns:w16se="http://schemas.microsoft.com/office/word/2015/wordml/symex" xmlns:wpg="http://schemas.microsoft.com/office/word/2010/wordprocessingGroup" xmlns:wpi="http://schemas.microsoft.com/office/word/2010/wordprocessingInk" xmlns:wne="http://schemas.microsoft.com/office/word/2006/wordml" xmlns:wps="http://schemas.microsoft.com/office/word/2010/wordprocessingShape" mc:Ignorable="w14 w15 w16se w16cid w16 w16cex w16sdtdh w16sdtfl w16du wp14">
   <w:p>
     <w:pPr>
       <w:pStyle w:val="Footer"/>
@@ -1509,7 +1620,7 @@
 </file>
 
 <file path=word/footnotes.xml><?xml version="1.0" encoding="utf-8"?>
-<w:footnotes xmlns:wpc="http://schemas.microsoft.com/office/word/2010/wordprocessingCanvas" xmlns:cx="http://schemas.microsoft.com/office/drawing/2014/chartex" xmlns:cx1="http://schemas.microsoft.com/office/drawing/2015/9/8/chartex" xmlns:cx2="http://schemas.microsoft.com/office/drawing/2015/10/21/chartex" xmlns:cx3="http://schemas.microsoft.com/office/drawing/2016/5/9/chartex" xmlns:cx4="http://schemas.microsoft.com/office/drawing/2016/5/10/chartex" xmlns:cx5="http://schemas.microsoft.com/office/drawing/2016/5/11/chartex" xmlns:cx6="http://schemas.microsoft.com/office/drawing/2016/5/12/chartex" xmlns:cx7="http://schemas.microsoft.com/office/drawing/2016/5/13/chartex" xmlns:cx8="http://schemas.microsoft.com/office/drawing/2016/5/14/chartex" xmlns:mc="http://schemas.openxmlformats.org/markup-compatibility/2006" xmlns:aink="http://schemas.microsoft.com/office/drawing/2016/ink" xmlns:am3d="http://schemas.microsoft.com/office/drawing/2017/model3d" xmlns:o="urn:schemas-microsoft-com:office:office" xmlns:oel="http://schemas.microsoft.com/office/2019/extlst" xmlns:r="http://schemas.openxmlformats.org/officeDocument/2006/relationships" xmlns:m="http://schemas.openxmlformats.org/officeDocument/2006/math" xmlns:v="urn:schemas-microsoft-com:vml" xmlns:wp14="http://schemas.microsoft.com/office/word/2010/wordprocessingDrawing" xmlns:wp="http://schemas.openxmlformats.org/drawingml/2006/wordprocessingDrawing" xmlns:w10="urn:schemas-microsoft-com:office:word" xmlns:w="http://schemas.openxmlformats.org/wordprocessingml/2006/main" xmlns:w14="http://schemas.microsoft.com/office/word/2010/wordml" xmlns:w15="http://schemas.microsoft.com/office/word/2012/wordml" xmlns:w16cex="http://schemas.microsoft.com/office/word/2018/wordml/cex" xmlns:w16cid="http://schemas.microsoft.com/office/word/2016/wordml/cid" xmlns:w16="http://schemas.microsoft.com/office/word/2018/wordml" xmlns:w16du="http://schemas.microsoft.com/office/word/2023/wordml/word16du" xmlns:w16sdtdh="http://schemas.microsoft.com/office/word/2020/wordml/sdtdatahash" xmlns:w16sdtfl="http://schemas.microsoft.com/office/word/2024/wordml/sdtformatlock" xmlns:w16se="http://schemas.microsoft.com/office/word/2015/wordml/symex" xmlns:wpg="http://schemas.microsoft.com/office/word/2010/wordprocessingGroup" xmlns:wpi="http://schemas.microsoft.com/office/word/2010/wordprocessingInk" xmlns:wne="http://schemas.microsoft.com/office/word/2006/wordml" xmlns:wps="http://schemas.microsoft.com/office/word/2010/wordprocessingShape" mc:Ignorable="w14 w15 w16se w16cid w16 w16cex w16sdtdh w16sdtfl w16du wp14">
+<w:footnotes xmlns:wpc="http://schemas.microsoft.com/office/word/2010/wordprocessingCanvas" xmlns:cx="http://schemas.microsoft.com/office/drawing/2014/chartex" xmlns:cx1="http://schemas.microsoft.com/office/drawing/2015/9/8/chartex" xmlns:cx2="http://schemas.microsoft.com/office/drawing/2015/10/21/chartex" xmlns:cx3="http://schemas.microsoft.com/office/drawing/2016/5/9/chartex" xmlns:cx4="http://schemas.microsoft.com/office/drawing/2016/5/10/chartex" xmlns:cx5="http://schemas.microsoft.com/office/drawing/2016/5/11/chartex" xmlns:cx6="http://schemas.microsoft.com/office/drawing/2016/5/12/chartex" xmlns:cx7="http://schemas.microsoft.com/office/drawing/2016/5/13/chartex" xmlns:cx8="http://schemas.microsoft.com/office/drawing/2016/5/14/chartex" xmlns:mc="http://schemas.openxmlformats.org/markup-compatibility/2006" xmlns:aink="http://schemas.microsoft.com/office/drawing/2016/ink" xmlns:am3d="http://schemas.microsoft.com/office/drawing/2017/model3d" xmlns:o="urn:schemas-microsoft-com:office:office" xmlns:oel="http://schemas.microsoft.com/office/2019/extlst" xmlns:r="http://schemas.openxmlformats.org/officeDocument/2006/relationships" xmlns:m="http://schemas.openxmlformats.org/officeDocument/2006/math" xmlns:v="urn:schemas-microsoft-com:vml" xmlns:wp14="http://schemas.microsoft.com/office/word/2010/wordprocessingDrawing" xmlns:wp="http://schemas.openxmlformats.org/drawingml/2006/wordprocessingDrawing" xmlns:w10="urn:schemas-microsoft-com:office:word" xmlns:w="http://schemas.openxmlformats.org/wordprocessingml/2006/main" xmlns:w14="http://schemas.microsoft.com/office/word/2010/wordml" xmlns:w15="http://schemas.microsoft.com/office/word/2012/wordml" xmlns:w16cei="http://schemas.microsoft.com/office/word/2026/wordml/cei" xmlns:w16cex="http://schemas.microsoft.com/office/word/2018/wordml/cex" xmlns:w16cid="http://schemas.microsoft.com/office/word/2016/wordml/cid" xmlns:w16="http://schemas.microsoft.com/office/word/2018/wordml" xmlns:w16du="http://schemas.microsoft.com/office/word/2023/wordml/word16du" xmlns:w16sdtdh="http://schemas.microsoft.com/office/word/2020/wordml/sdtdatahash" xmlns:w16sdtfl="http://schemas.microsoft.com/office/word/2024/wordml/sdtformatlock" xmlns:w16se="http://schemas.microsoft.com/office/word/2015/wordml/symex" xmlns:wpg="http://schemas.microsoft.com/office/word/2010/wordprocessingGroup" xmlns:wpi="http://schemas.microsoft.com/office/word/2010/wordprocessingInk" xmlns:wne="http://schemas.microsoft.com/office/word/2006/wordml" xmlns:wps="http://schemas.microsoft.com/office/word/2010/wordprocessingShape" mc:Ignorable="w14 w15 w16se w16cid w16 w16cex w16sdtdh w16sdtfl w16du wp14">
   <w:footnote w:type="separator" w:id="-1">
     <w:p>
       <w:pPr>
@@ -1534,7 +1645,7 @@
 </file>
 
 <file path=word/header1.xml><?xml version="1.0" encoding="utf-8"?>
-<w:hdr xmlns:wpc="http://schemas.microsoft.com/office/word/2010/wordprocessingCanvas" xmlns:cx="http://schemas.microsoft.com/office/drawing/2014/chartex" xmlns:cx1="http://schemas.microsoft.com/office/drawing/2015/9/8/chartex" xmlns:cx2="http://schemas.microsoft.com/office/drawing/2015/10/21/chartex" xmlns:cx3="http://schemas.microsoft.com/office/drawing/2016/5/9/chartex" xmlns:cx4="http://schemas.microsoft.com/office/drawing/2016/5/10/chartex" xmlns:cx5="http://schemas.microsoft.com/office/drawing/2016/5/11/chartex" xmlns:cx6="http://schemas.microsoft.com/office/drawing/2016/5/12/chartex" xmlns:cx7="http://schemas.microsoft.com/office/drawing/2016/5/13/chartex" xmlns:cx8="http://schemas.microsoft.com/office/drawing/2016/5/14/chartex" xmlns:mc="http://schemas.openxmlformats.org/markup-compatibility/2006" xmlns:aink="http://schemas.microsoft.com/office/drawing/2016/ink" xmlns:am3d="http://schemas.microsoft.com/office/drawing/2017/model3d" xmlns:o="urn:schemas-microsoft-com:office:office" xmlns:oel="http://schemas.microsoft.com/office/2019/extlst" xmlns:r="http://schemas.openxmlformats.org/officeDocument/2006/relationships" xmlns:m="http://schemas.openxmlformats.org/officeDocument/2006/math" xmlns:v="urn:schemas-microsoft-com:vml" xmlns:wp14="http://schemas.microsoft.com/office/word/2010/wordprocessingDrawing" xmlns:wp="http://schemas.openxmlformats.org/drawingml/2006/wordprocessingDrawing" xmlns:w10="urn:schemas-microsoft-com:office:word" xmlns:w="http://schemas.openxmlformats.org/wordprocessingml/2006/main" xmlns:w14="http://schemas.microsoft.com/office/word/2010/wordml" xmlns:w15="http://schemas.microsoft.com/office/word/2012/wordml" xmlns:w16cex="http://schemas.microsoft.com/office/word/2018/wordml/cex" xmlns:w16cid="http://schemas.microsoft.com/office/word/2016/wordml/cid" xmlns:w16="http://schemas.microsoft.com/office/word/2018/wordml" xmlns:w16du="http://schemas.microsoft.com/office/word/2023/wordml/word16du" xmlns:w16sdtdh="http://schemas.microsoft.com/office/word/2020/wordml/sdtdatahash" xmlns:w16sdtfl="http://schemas.microsoft.com/office/word/2024/wordml/sdtformatlock" xmlns:w16se="http://schemas.microsoft.com/office/word/2015/wordml/symex" xmlns:wpg="http://schemas.microsoft.com/office/word/2010/wordprocessingGroup" xmlns:wpi="http://schemas.microsoft.com/office/word/2010/wordprocessingInk" xmlns:wne="http://schemas.microsoft.com/office/word/2006/wordml" xmlns:wps="http://schemas.microsoft.com/office/word/2010/wordprocessingShape" mc:Ignorable="w14 w15 w16se w16cid w16 w16cex w16sdtdh w16sdtfl w16du wp14">
+<w:hdr xmlns:wpc="http://schemas.microsoft.com/office/word/2010/wordprocessingCanvas" xmlns:cx="http://schemas.microsoft.com/office/drawing/2014/chartex" xmlns:cx1="http://schemas.microsoft.com/office/drawing/2015/9/8/chartex" xmlns:cx2="http://schemas.microsoft.com/office/drawing/2015/10/21/chartex" xmlns:cx3="http://schemas.microsoft.com/office/drawing/2016/5/9/chartex" xmlns:cx4="http://schemas.microsoft.com/office/drawing/2016/5/10/chartex" xmlns:cx5="http://schemas.microsoft.com/office/drawing/2016/5/11/chartex" xmlns:cx6="http://schemas.microsoft.com/office/drawing/2016/5/12/chartex" xmlns:cx7="http://schemas.microsoft.com/office/drawing/2016/5/13/chartex" xmlns:cx8="http://schemas.microsoft.com/office/drawing/2016/5/14/chartex" xmlns:mc="http://schemas.openxmlformats.org/markup-compatibility/2006" xmlns:aink="http://schemas.microsoft.com/office/drawing/2016/ink" xmlns:am3d="http://schemas.microsoft.com/office/drawing/2017/model3d" xmlns:o="urn:schemas-microsoft-com:office:office" xmlns:oel="http://schemas.microsoft.com/office/2019/extlst" xmlns:r="http://schemas.openxmlformats.org/officeDocument/2006/relationships" xmlns:m="http://schemas.openxmlformats.org/officeDocument/2006/math" xmlns:v="urn:schemas-microsoft-com:vml" xmlns:wp14="http://schemas.microsoft.com/office/word/2010/wordprocessingDrawing" xmlns:wp="http://schemas.openxmlformats.org/drawingml/2006/wordprocessingDrawing" xmlns:w10="urn:schemas-microsoft-com:office:word" xmlns:w="http://schemas.openxmlformats.org/wordprocessingml/2006/main" xmlns:w14="http://schemas.microsoft.com/office/word/2010/wordml" xmlns:w15="http://schemas.microsoft.com/office/word/2012/wordml" xmlns:w16cei="http://schemas.microsoft.com/office/word/2026/wordml/cei" xmlns:w16cex="http://schemas.microsoft.com/office/word/2018/wordml/cex" xmlns:w16cid="http://schemas.microsoft.com/office/word/2016/wordml/cid" xmlns:w16="http://schemas.microsoft.com/office/word/2018/wordml" xmlns:w16du="http://schemas.microsoft.com/office/word/2023/wordml/word16du" xmlns:w16sdtdh="http://schemas.microsoft.com/office/word/2020/wordml/sdtdatahash" xmlns:w16sdtfl="http://schemas.microsoft.com/office/word/2024/wordml/sdtformatlock" xmlns:w16se="http://schemas.microsoft.com/office/word/2015/wordml/symex" xmlns:wpg="http://schemas.microsoft.com/office/word/2010/wordprocessingGroup" xmlns:wpi="http://schemas.microsoft.com/office/word/2010/wordprocessingInk" xmlns:wne="http://schemas.microsoft.com/office/word/2006/wordml" xmlns:wps="http://schemas.microsoft.com/office/word/2010/wordprocessingShape" mc:Ignorable="w14 w15 w16se w16cid w16 w16cex w16sdtdh w16sdtfl w16du wp14">
   <w:p>
     <w:pPr>
       <w:pStyle w:val="Header"/>
@@ -1544,7 +1655,7 @@
 </file>
 
 <file path=word/header2.xml><?xml version="1.0" encoding="utf-8"?>
-<w:hdr xmlns:wpc="http://schemas.microsoft.com/office/word/2010/wordprocessingCanvas" xmlns:cx="http://schemas.microsoft.com/office/drawing/2014/chartex" xmlns:cx1="http://schemas.microsoft.com/office/drawing/2015/9/8/chartex" xmlns:cx2="http://schemas.microsoft.com/office/drawing/2015/10/21/chartex" xmlns:cx3="http://schemas.microsoft.com/office/drawing/2016/5/9/chartex" xmlns:cx4="http://schemas.microsoft.com/office/drawing/2016/5/10/chartex" xmlns:cx5="http://schemas.microsoft.com/office/drawing/2016/5/11/chartex" xmlns:cx6="http://schemas.microsoft.com/office/drawing/2016/5/12/chartex" xmlns:cx7="http://schemas.microsoft.com/office/drawing/2016/5/13/chartex" xmlns:cx8="http://schemas.microsoft.com/office/drawing/2016/5/14/chartex" xmlns:mc="http://schemas.openxmlformats.org/markup-compatibility/2006" xmlns:aink="http://schemas.microsoft.com/office/drawing/2016/ink" xmlns:am3d="http://schemas.microsoft.com/office/drawing/2017/model3d" xmlns:o="urn:schemas-microsoft-com:office:office" xmlns:oel="http://schemas.microsoft.com/office/2019/extlst" xmlns:r="http://schemas.openxmlformats.org/officeDocument/2006/relationships" xmlns:m="http://schemas.openxmlformats.org/officeDocument/2006/math" xmlns:v="urn:schemas-microsoft-com:vml" xmlns:wp14="http://schemas.microsoft.com/office/word/2010/wordprocessingDrawing" xmlns:wp="http://schemas.openxmlformats.org/drawingml/2006/wordprocessingDrawing" xmlns:w10="urn:schemas-microsoft-com:office:word" xmlns:w="http://schemas.openxmlformats.org/wordprocessingml/2006/main" xmlns:w14="http://schemas.microsoft.com/office/word/2010/wordml" xmlns:w15="http://schemas.microsoft.com/office/word/2012/wordml" xmlns:w16cex="http://schemas.microsoft.com/office/word/2018/wordml/cex" xmlns:w16cid="http://schemas.microsoft.com/office/word/2016/wordml/cid" xmlns:w16="http://schemas.microsoft.com/office/word/2018/wordml" xmlns:w16du="http://schemas.microsoft.com/office/word/2023/wordml/word16du" xmlns:w16sdtdh="http://schemas.microsoft.com/office/word/2020/wordml/sdtdatahash" xmlns:w16sdtfl="http://schemas.microsoft.com/office/word/2024/wordml/sdtformatlock" xmlns:w16se="http://schemas.microsoft.com/office/word/2015/wordml/symex" xmlns:wpg="http://schemas.microsoft.com/office/word/2010/wordprocessingGroup" xmlns:wpi="http://schemas.microsoft.com/office/word/2010/wordprocessingInk" xmlns:wne="http://schemas.microsoft.com/office/word/2006/wordml" xmlns:wps="http://schemas.microsoft.com/office/word/2010/wordprocessingShape" mc:Ignorable="w14 w15 w16se w16cid w16 w16cex w16sdtdh w16sdtfl w16du wp14">
+<w:hdr xmlns:wpc="http://schemas.microsoft.com/office/word/2010/wordprocessingCanvas" xmlns:cx="http://schemas.microsoft.com/office/drawing/2014/chartex" xmlns:cx1="http://schemas.microsoft.com/office/drawing/2015/9/8/chartex" xmlns:cx2="http://schemas.microsoft.com/office/drawing/2015/10/21/chartex" xmlns:cx3="http://schemas.microsoft.com/office/drawing/2016/5/9/chartex" xmlns:cx4="http://schemas.microsoft.com/office/drawing/2016/5/10/chartex" xmlns:cx5="http://schemas.microsoft.com/office/drawing/2016/5/11/chartex" xmlns:cx6="http://schemas.microsoft.com/office/drawing/2016/5/12/chartex" xmlns:cx7="http://schemas.microsoft.com/office/drawing/2016/5/13/chartex" xmlns:cx8="http://schemas.microsoft.com/office/drawing/2016/5/14/chartex" xmlns:mc="http://schemas.openxmlformats.org/markup-compatibility/2006" xmlns:aink="http://schemas.microsoft.com/office/drawing/2016/ink" xmlns:am3d="http://schemas.microsoft.com/office/drawing/2017/model3d" xmlns:o="urn:schemas-microsoft-com:office:office" xmlns:oel="http://schemas.microsoft.com/office/2019/extlst" xmlns:r="http://schemas.openxmlformats.org/officeDocument/2006/relationships" xmlns:m="http://schemas.openxmlformats.org/officeDocument/2006/math" xmlns:v="urn:schemas-microsoft-com:vml" xmlns:wp14="http://schemas.microsoft.com/office/word/2010/wordprocessingDrawing" xmlns:wp="http://schemas.openxmlformats.org/drawingml/2006/wordprocessingDrawing" xmlns:w10="urn:schemas-microsoft-com:office:word" xmlns:w="http://schemas.openxmlformats.org/wordprocessingml/2006/main" xmlns:w14="http://schemas.microsoft.com/office/word/2010/wordml" xmlns:w15="http://schemas.microsoft.com/office/word/2012/wordml" xmlns:w16cei="http://schemas.microsoft.com/office/word/2026/wordml/cei" xmlns:w16cex="http://schemas.microsoft.com/office/word/2018/wordml/cex" xmlns:w16cid="http://schemas.microsoft.com/office/word/2016/wordml/cid" xmlns:w16="http://schemas.microsoft.com/office/word/2018/wordml" xmlns:w16du="http://schemas.microsoft.com/office/word/2023/wordml/word16du" xmlns:w16sdtdh="http://schemas.microsoft.com/office/word/2020/wordml/sdtdatahash" xmlns:w16sdtfl="http://schemas.microsoft.com/office/word/2024/wordml/sdtformatlock" xmlns:w16se="http://schemas.microsoft.com/office/word/2015/wordml/symex" xmlns:wpg="http://schemas.microsoft.com/office/word/2010/wordprocessingGroup" xmlns:wpi="http://schemas.microsoft.com/office/word/2010/wordprocessingInk" xmlns:wne="http://schemas.microsoft.com/office/word/2006/wordml" xmlns:wps="http://schemas.microsoft.com/office/word/2010/wordprocessingShape" mc:Ignorable="w14 w15 w16se w16cid w16 w16cex w16sdtdh w16sdtfl w16du wp14">
   <w:p>
     <w:pPr>
       <w:pStyle w:val="Header"/>
@@ -1628,7 +1739,7 @@
 </file>
 
 <file path=word/header3.xml><?xml version="1.0" encoding="utf-8"?>
-<w:hdr xmlns:wpc="http://schemas.microsoft.com/office/word/2010/wordprocessingCanvas" xmlns:cx="http://schemas.microsoft.com/office/drawing/2014/chartex" xmlns:cx1="http://schemas.microsoft.com/office/drawing/2015/9/8/chartex" xmlns:cx2="http://schemas.microsoft.com/office/drawing/2015/10/21/chartex" xmlns:cx3="http://schemas.microsoft.com/office/drawing/2016/5/9/chartex" xmlns:cx4="http://schemas.microsoft.com/office/drawing/2016/5/10/chartex" xmlns:cx5="http://schemas.microsoft.com/office/drawing/2016/5/11/chartex" xmlns:cx6="http://schemas.microsoft.com/office/drawing/2016/5/12/chartex" xmlns:cx7="http://schemas.microsoft.com/office/drawing/2016/5/13/chartex" xmlns:cx8="http://schemas.microsoft.com/office/drawing/2016/5/14/chartex" xmlns:mc="http://schemas.openxmlformats.org/markup-compatibility/2006" xmlns:aink="http://schemas.microsoft.com/office/drawing/2016/ink" xmlns:am3d="http://schemas.microsoft.com/office/drawing/2017/model3d" xmlns:o="urn:schemas-microsoft-com:office:office" xmlns:oel="http://schemas.microsoft.com/office/2019/extlst" xmlns:r="http://schemas.openxmlformats.org/officeDocument/2006/relationships" xmlns:m="http://schemas.openxmlformats.org/officeDocument/2006/math" xmlns:v="urn:schemas-microsoft-com:vml" xmlns:wp14="http://schemas.microsoft.com/office/word/2010/wordprocessingDrawing" xmlns:wp="http://schemas.openxmlformats.org/drawingml/2006/wordprocessingDrawing" xmlns:w10="urn:schemas-microsoft-com:office:word" xmlns:w="http://schemas.openxmlformats.org/wordprocessingml/2006/main" xmlns:w14="http://schemas.microsoft.com/office/word/2010/wordml" xmlns:w15="http://schemas.microsoft.com/office/word/2012/wordml" xmlns:w16cex="http://schemas.microsoft.com/office/word/2018/wordml/cex" xmlns:w16cid="http://schemas.microsoft.com/office/word/2016/wordml/cid" xmlns:w16="http://schemas.microsoft.com/office/word/2018/wordml" xmlns:w16du="http://schemas.microsoft.com/office/word/2023/wordml/word16du" xmlns:w16sdtdh="http://schemas.microsoft.com/office/word/2020/wordml/sdtdatahash" xmlns:w16sdtfl="http://schemas.microsoft.com/office/word/2024/wordml/sdtformatlock" xmlns:w16se="http://schemas.microsoft.com/office/word/2015/wordml/symex" xmlns:wpg="http://schemas.microsoft.com/office/word/2010/wordprocessingGroup" xmlns:wpi="http://schemas.microsoft.com/office/word/2010/wordprocessingInk" xmlns:wne="http://schemas.microsoft.com/office/word/2006/wordml" xmlns:wps="http://schemas.microsoft.com/office/word/2010/wordprocessingShape" mc:Ignorable="w14 w15 w16se w16cid w16 w16cex w16sdtdh w16sdtfl w16du wp14">
+<w:hdr xmlns:wpc="http://schemas.microsoft.com/office/word/2010/wordprocessingCanvas" xmlns:cx="http://schemas.microsoft.com/office/drawing/2014/chartex" xmlns:cx1="http://schemas.microsoft.com/office/drawing/2015/9/8/chartex" xmlns:cx2="http://schemas.microsoft.com/office/drawing/2015/10/21/chartex" xmlns:cx3="http://schemas.microsoft.com/office/drawing/2016/5/9/chartex" xmlns:cx4="http://schemas.microsoft.com/office/drawing/2016/5/10/chartex" xmlns:cx5="http://schemas.microsoft.com/office/drawing/2016/5/11/chartex" xmlns:cx6="http://schemas.microsoft.com/office/drawing/2016/5/12/chartex" xmlns:cx7="http://schemas.microsoft.com/office/drawing/2016/5/13/chartex" xmlns:cx8="http://schemas.microsoft.com/office/drawing/2016/5/14/chartex" xmlns:mc="http://schemas.openxmlformats.org/markup-compatibility/2006" xmlns:aink="http://schemas.microsoft.com/office/drawing/2016/ink" xmlns:am3d="http://schemas.microsoft.com/office/drawing/2017/model3d" xmlns:o="urn:schemas-microsoft-com:office:office" xmlns:oel="http://schemas.microsoft.com/office/2019/extlst" xmlns:r="http://schemas.openxmlformats.org/officeDocument/2006/relationships" xmlns:m="http://schemas.openxmlformats.org/officeDocument/2006/math" xmlns:v="urn:schemas-microsoft-com:vml" xmlns:wp14="http://schemas.microsoft.com/office/word/2010/wordprocessingDrawing" xmlns:wp="http://schemas.openxmlformats.org/drawingml/2006/wordprocessingDrawing" xmlns:w10="urn:schemas-microsoft-com:office:word" xmlns:w="http://schemas.openxmlformats.org/wordprocessingml/2006/main" xmlns:w14="http://schemas.microsoft.com/office/word/2010/wordml" xmlns:w15="http://schemas.microsoft.com/office/word/2012/wordml" xmlns:w16cei="http://schemas.microsoft.com/office/word/2026/wordml/cei" xmlns:w16cex="http://schemas.microsoft.com/office/word/2018/wordml/cex" xmlns:w16cid="http://schemas.microsoft.com/office/word/2016/wordml/cid" xmlns:w16="http://schemas.microsoft.com/office/word/2018/wordml" xmlns:w16du="http://schemas.microsoft.com/office/word/2023/wordml/word16du" xmlns:w16sdtdh="http://schemas.microsoft.com/office/word/2020/wordml/sdtdatahash" xmlns:w16sdtfl="http://schemas.microsoft.com/office/word/2024/wordml/sdtformatlock" xmlns:w16se="http://schemas.microsoft.com/office/word/2015/wordml/symex" xmlns:wpg="http://schemas.microsoft.com/office/word/2010/wordprocessingGroup" xmlns:wpi="http://schemas.microsoft.com/office/word/2010/wordprocessingInk" xmlns:wne="http://schemas.microsoft.com/office/word/2006/wordml" xmlns:wps="http://schemas.microsoft.com/office/word/2010/wordprocessingShape" mc:Ignorable="w14 w15 w16se w16cid w16 w16cex w16sdtdh w16sdtfl w16du wp14">
   <w:p>
     <w:pPr>
       <w:pStyle w:val="Header"/>
@@ -1638,7 +1749,7 @@
 </file>
 
 <file path=word/numbering.xml><?xml version="1.0" encoding="utf-8"?>
-<w:numbering xmlns:wpc="http://schemas.microsoft.com/office/word/2010/wordprocessingCanvas" xmlns:cx="http://schemas.microsoft.com/office/drawing/2014/chartex" xmlns:cx1="http://schemas.microsoft.com/office/drawing/2015/9/8/chartex" xmlns:cx2="http://schemas.microsoft.com/office/drawing/2015/10/21/chartex" xmlns:cx3="http://schemas.microsoft.com/office/drawing/2016/5/9/chartex" xmlns:cx4="http://schemas.microsoft.com/office/drawing/2016/5/10/chartex" xmlns:cx5="http://schemas.microsoft.com/office/drawing/2016/5/11/chartex" xmlns:cx6="http://schemas.microsoft.com/office/drawing/2016/5/12/chartex" xmlns:cx7="http://schemas.microsoft.com/office/drawing/2016/5/13/chartex" xmlns:cx8="http://schemas.microsoft.com/office/drawing/2016/5/14/chartex" xmlns:mc="http://schemas.openxmlformats.org/markup-compatibility/2006" xmlns:aink="http://schemas.microsoft.com/office/drawing/2016/ink" xmlns:am3d="http://schemas.microsoft.com/office/drawing/2017/model3d" xmlns:o="urn:schemas-microsoft-com:office:office" xmlns:oel="http://schemas.microsoft.com/office/2019/extlst" xmlns:r="http://schemas.openxmlformats.org/officeDocument/2006/relationships" xmlns:m="http://schemas.openxmlformats.org/officeDocument/2006/math" xmlns:v="urn:schemas-microsoft-com:vml" xmlns:wp14="http://schemas.microsoft.com/office/word/2010/wordprocessingDrawing" xmlns:wp="http://schemas.openxmlformats.org/drawingml/2006/wordprocessingDrawing" xmlns:w10="urn:schemas-microsoft-com:office:word" xmlns:w="http://schemas.openxmlformats.org/wordprocessingml/2006/main" xmlns:w14="http://schemas.microsoft.com/office/word/2010/wordml" xmlns:w15="http://schemas.microsoft.com/office/word/2012/wordml" xmlns:w16cex="http://schemas.microsoft.com/office/word/2018/wordml/cex" xmlns:w16cid="http://schemas.microsoft.com/office/word/2016/wordml/cid" xmlns:w16="http://schemas.microsoft.com/office/word/2018/wordml" xmlns:w16du="http://schemas.microsoft.com/office/word/2023/wordml/word16du" xmlns:w16sdtdh="http://schemas.microsoft.com/office/word/2020/wordml/sdtdatahash" xmlns:w16sdtfl="http://schemas.microsoft.com/office/word/2024/wordml/sdtformatlock" xmlns:w16se="http://schemas.microsoft.com/office/word/2015/wordml/symex" xmlns:wpg="http://schemas.microsoft.com/office/word/2010/wordprocessingGroup" xmlns:wpi="http://schemas.microsoft.com/office/word/2010/wordprocessingInk" xmlns:wne="http://schemas.microsoft.com/office/word/2006/wordml" xmlns:wps="http://schemas.microsoft.com/office/word/2010/wordprocessingShape" mc:Ignorable="w14 w15 w16se w16cid w16 w16cex w16sdtdh w16sdtfl w16du wp14">
+<w:numbering xmlns:wpc="http://schemas.microsoft.com/office/word/2010/wordprocessingCanvas" xmlns:cx="http://schemas.microsoft.com/office/drawing/2014/chartex" xmlns:cx1="http://schemas.microsoft.com/office/drawing/2015/9/8/chartex" xmlns:cx2="http://schemas.microsoft.com/office/drawing/2015/10/21/chartex" xmlns:cx3="http://schemas.microsoft.com/office/drawing/2016/5/9/chartex" xmlns:cx4="http://schemas.microsoft.com/office/drawing/2016/5/10/chartex" xmlns:cx5="http://schemas.microsoft.com/office/drawing/2016/5/11/chartex" xmlns:cx6="http://schemas.microsoft.com/office/drawing/2016/5/12/chartex" xmlns:cx7="http://schemas.microsoft.com/office/drawing/2016/5/13/chartex" xmlns:cx8="http://schemas.microsoft.com/office/drawing/2016/5/14/chartex" xmlns:mc="http://schemas.openxmlformats.org/markup-compatibility/2006" xmlns:aink="http://schemas.microsoft.com/office/drawing/2016/ink" xmlns:am3d="http://schemas.microsoft.com/office/drawing/2017/model3d" xmlns:o="urn:schemas-microsoft-com:office:office" xmlns:oel="http://schemas.microsoft.com/office/2019/extlst" xmlns:r="http://schemas.openxmlformats.org/officeDocument/2006/relationships" xmlns:m="http://schemas.openxmlformats.org/officeDocument/2006/math" xmlns:v="urn:schemas-microsoft-com:vml" xmlns:wp14="http://schemas.microsoft.com/office/word/2010/wordprocessingDrawing" xmlns:wp="http://schemas.openxmlformats.org/drawingml/2006/wordprocessingDrawing" xmlns:w10="urn:schemas-microsoft-com:office:word" xmlns:w="http://schemas.openxmlformats.org/wordprocessingml/2006/main" xmlns:w14="http://schemas.microsoft.com/office/word/2010/wordml" xmlns:w15="http://schemas.microsoft.com/office/word/2012/wordml" xmlns:w16cei="http://schemas.microsoft.com/office/word/2026/wordml/cei" xmlns:w16cex="http://schemas.microsoft.com/office/word/2018/wordml/cex" xmlns:w16cid="http://schemas.microsoft.com/office/word/2016/wordml/cid" xmlns:w16="http://schemas.microsoft.com/office/word/2018/wordml" xmlns:w16du="http://schemas.microsoft.com/office/word/2023/wordml/word16du" xmlns:w16sdtdh="http://schemas.microsoft.com/office/word/2020/wordml/sdtdatahash" xmlns:w16sdtfl="http://schemas.microsoft.com/office/word/2024/wordml/sdtformatlock" xmlns:w16se="http://schemas.microsoft.com/office/word/2015/wordml/symex" xmlns:wpg="http://schemas.microsoft.com/office/word/2010/wordprocessingGroup" xmlns:wpi="http://schemas.microsoft.com/office/word/2010/wordprocessingInk" xmlns:wne="http://schemas.microsoft.com/office/word/2006/wordml" xmlns:wps="http://schemas.microsoft.com/office/word/2010/wordprocessingShape" mc:Ignorable="w14 w15 w16se w16cid w16 w16cex w16sdtdh w16sdtfl w16du wp14">
   <w:abstractNum w:abstractNumId="0" w15:restartNumberingAfterBreak="0">
     <w:nsid w:val="145119B3"/>
     <w:multiLevelType w:val="hybridMultilevel"/>
@@ -3152,21 +3263,6 @@
 </file>
 
 <file path=customXml/item1.xml><?xml version="1.0" encoding="utf-8"?>
-<b:Sources xmlns:b="http://schemas.openxmlformats.org/officeDocument/2006/bibliography" xmlns="http://schemas.openxmlformats.org/officeDocument/2006/bibliography" SelectedStyle="/APASixthEditionOfficeOnline.xsl" StyleName="APA" Version="6"/>
-</file>
-
-<file path=customXml/item2.xml><?xml version="1.0" encoding="utf-8"?>
-<p:properties xmlns:p="http://schemas.microsoft.com/office/2006/metadata/properties" xmlns:xsi="http://www.w3.org/2001/XMLSchema-instance" xmlns:pc="http://schemas.microsoft.com/office/infopath/2007/PartnerControls">
-  <documentManagement>
-    <lcf76f155ced4ddcb4097134ff3c332f xmlns="e789b7fa-a83c-4c6b-9e01-87c723f67228">
-      <Terms xmlns="http://schemas.microsoft.com/office/infopath/2007/PartnerControls"/>
-    </lcf76f155ced4ddcb4097134ff3c332f>
-    <TaxCatchAll xmlns="bb952b06-3268-4e55-b0fe-9eb49669fc08" xsi:nil="true"/>
-  </documentManagement>
-</p:properties>
-</file>
-
-<file path=customXml/item3.xml><?xml version="1.0" encoding="utf-8"?>
 <?mso-contentType ?>
 <FormTemplates xmlns="http://schemas.microsoft.com/sharepoint/v3/contenttype/forms">
   <Display>DocumentLibraryForm</Display>
@@ -3175,7 +3271,7 @@
 </FormTemplates>
 </file>
 
-<file path=customXml/item4.xml><?xml version="1.0" encoding="utf-8"?>
+<file path=customXml/item2.xml><?xml version="1.0" encoding="utf-8"?>
 <ct:contentTypeSchema xmlns:ct="http://schemas.microsoft.com/office/2006/metadata/contentType" xmlns:ma="http://schemas.microsoft.com/office/2006/metadata/properties/metaAttributes" ct:_="" ma:_="" ma:contentTypeName="Document" ma:contentTypeID="0x010100B89331DE8EA64F4FBEA00113BF0E4514" ma:contentTypeVersion="11" ma:contentTypeDescription="Create a new document." ma:contentTypeScope="" ma:versionID="0b60b04e60edb8b2e7e2fe1cc7d413e0">
   <xsd:schema xmlns:xsd="http://www.w3.org/2001/XMLSchema" xmlns:xs="http://www.w3.org/2001/XMLSchema" xmlns:p="http://schemas.microsoft.com/office/2006/metadata/properties" xmlns:ns2="e789b7fa-a83c-4c6b-9e01-87c723f67228" xmlns:ns3="bb952b06-3268-4e55-b0fe-9eb49669fc08" targetNamespace="http://schemas.microsoft.com/office/2006/metadata/properties" ma:root="true" ma:fieldsID="52467e30880403e5f73a15b97b0992c8" ns2:_="" ns3:_="">
     <xsd:import namespace="e789b7fa-a83c-4c6b-9e01-87c723f67228"/>
@@ -3370,26 +3466,22 @@
 </ct:contentTypeSchema>
 </file>
 
-<file path=customXml/itemProps1.xml><?xml version="1.0" encoding="utf-8"?>
-<ds:datastoreItem xmlns:ds="http://schemas.openxmlformats.org/officeDocument/2006/customXml" ds:itemID="{3B4892E8-18D6-D444-BA6E-299F0B60384F}">
-  <ds:schemaRefs>
-    <ds:schemaRef ds:uri="http://schemas.openxmlformats.org/officeDocument/2006/bibliography"/>
-  </ds:schemaRefs>
-</ds:datastoreItem>
+<file path=customXml/item3.xml><?xml version="1.0" encoding="utf-8"?>
+<b:Sources xmlns:b="http://schemas.openxmlformats.org/officeDocument/2006/bibliography" xmlns="http://schemas.openxmlformats.org/officeDocument/2006/bibliography" SelectedStyle="/APASixthEditionOfficeOnline.xsl" StyleName="APA" Version="6"/>
 </file>
 
-<file path=customXml/itemProps2.xml><?xml version="1.0" encoding="utf-8"?>
-<ds:datastoreItem xmlns:ds="http://schemas.openxmlformats.org/officeDocument/2006/customXml" ds:itemID="{EF43FDED-CD1D-4301-B761-71C1DCC851CC}">
-  <ds:schemaRefs>
-    <ds:schemaRef ds:uri="http://schemas.microsoft.com/office/2006/metadata/properties"/>
-    <ds:schemaRef ds:uri="http://schemas.microsoft.com/office/infopath/2007/PartnerControls"/>
-    <ds:schemaRef ds:uri="e789b7fa-a83c-4c6b-9e01-87c723f67228"/>
-    <ds:schemaRef ds:uri="bb952b06-3268-4e55-b0fe-9eb49669fc08"/>
-  </ds:schemaRefs>
-</ds:datastoreItem>
+<file path=customXml/item4.xml><?xml version="1.0" encoding="utf-8"?>
+<p:properties xmlns:p="http://schemas.microsoft.com/office/2006/metadata/properties" xmlns:xsi="http://www.w3.org/2001/XMLSchema-instance" xmlns:pc="http://schemas.microsoft.com/office/infopath/2007/PartnerControls">
+  <documentManagement>
+    <lcf76f155ced4ddcb4097134ff3c332f xmlns="e789b7fa-a83c-4c6b-9e01-87c723f67228">
+      <Terms xmlns="http://schemas.microsoft.com/office/infopath/2007/PartnerControls"/>
+    </lcf76f155ced4ddcb4097134ff3c332f>
+    <TaxCatchAll xmlns="bb952b06-3268-4e55-b0fe-9eb49669fc08" xsi:nil="true"/>
+  </documentManagement>
+</p:properties>
 </file>
 
-<file path=customXml/itemProps3.xml><?xml version="1.0" encoding="utf-8"?>
+<file path=customXml/itemProps1.xml><?xml version="1.0" encoding="utf-8"?>
 <ds:datastoreItem xmlns:ds="http://schemas.openxmlformats.org/officeDocument/2006/customXml" ds:itemID="{45FB1F57-968F-4A6E-AEE9-65961EB5FADD}">
   <ds:schemaRefs>
     <ds:schemaRef ds:uri="http://schemas.microsoft.com/sharepoint/v3/contenttype/forms"/>
@@ -3397,7 +3489,7 @@
 </ds:datastoreItem>
 </file>
 
-<file path=customXml/itemProps4.xml><?xml version="1.0" encoding="utf-8"?>
+<file path=customXml/itemProps2.xml><?xml version="1.0" encoding="utf-8"?>
 <ds:datastoreItem xmlns:ds="http://schemas.openxmlformats.org/officeDocument/2006/customXml" ds:itemID="{93F00A47-6514-4C46-91C6-8D2331E8318E}">
   <ds:schemaRefs>
     <ds:schemaRef ds:uri="http://schemas.microsoft.com/office/2006/metadata/contentType"/>
@@ -3414,4 +3506,23 @@
     <ds:schemaRef ds:uri="http://schemas.microsoft.com/internal/obd"/>
   </ds:schemaRefs>
 </ds:datastoreItem>
+</file>
+
+<file path=customXml/itemProps3.xml><?xml version="1.0" encoding="utf-8"?>
+<ds:datastoreItem xmlns:ds="http://schemas.openxmlformats.org/officeDocument/2006/customXml" ds:itemID="{3B4892E8-18D6-D444-BA6E-299F0B60384F}">
+  <ds:schemaRefs>
+    <ds:schemaRef ds:uri="http://schemas.openxmlformats.org/officeDocument/2006/bibliography"/>
+  </ds:schemaRefs>
+</ds:datastoreItem>
+</file>
+
+<file path=customXml/itemProps4.xml><?xml version="1.0" encoding="utf-8"?>
+<ds:datastoreItem xmlns:ds="http://schemas.openxmlformats.org/officeDocument/2006/customXml" ds:itemID="{EF43FDED-CD1D-4301-B761-71C1DCC851CC}">
+  <ds:schemaRefs>
+    <ds:schemaRef ds:uri="http://schemas.microsoft.com/office/2006/metadata/properties"/>
+    <ds:schemaRef ds:uri="http://schemas.microsoft.com/office/infopath/2007/PartnerControls"/>
+    <ds:schemaRef ds:uri="e789b7fa-a83c-4c6b-9e01-87c723f67228"/>
+    <ds:schemaRef ds:uri="bb952b06-3268-4e55-b0fe-9eb49669fc08"/>
+  </ds:schemaRefs>
+</ds:datastoreItem>
 </file>
</xml_diff>

<commit_message>
Fix Pre-App Recommend Condition Letter policy to use HE4
</commit_message>
<xml_diff>
--- a/arches_her/docx/Pre-App Recommend Condition Letter.docx
+++ b/arches_her/docx/Pre-App Recommend Condition Letter.docx
@@ -768,7 +768,13 @@
         <w:rPr>
           <w:rFonts w:cstheme="minorHAnsi"/>
         </w:rPr>
-        <w:t xml:space="preserve"> HE5</w:t>
+        <w:t xml:space="preserve"> HE</w:t>
+      </w:r>
+      <w:r>
+        <w:rPr>
+          <w:rFonts w:cstheme="minorHAnsi"/>
+        </w:rPr>
+        <w:t>4</w:t>
       </w:r>
       <w:r>
         <w:rPr>
@@ -947,21 +953,7 @@
         <w:rPr>
           <w:rFonts w:cstheme="minorHAnsi"/>
         </w:rPr>
-        <w:t xml:space="preserve">Pre-commencement conditions are necessary to safeguard the archaeological interest on sites. Approval of a WSI before works begin on site provides clarity on what investigations are required, and their timing in relation to the development programme. If the applicant does not agree to a pre-commencement </w:t>
-      </w:r>
-      <w:proofErr w:type="gramStart"/>
-      <w:r>
-        <w:rPr>
-          <w:rFonts w:cstheme="minorHAnsi"/>
-        </w:rPr>
-        <w:t>condition</w:t>
-      </w:r>
-      <w:proofErr w:type="gramEnd"/>
-      <w:r>
-        <w:rPr>
-          <w:rFonts w:cstheme="minorHAnsi"/>
-        </w:rPr>
-        <w:t xml:space="preserve"> please let us know their reasons and any alternatives suggested. Without the recommended pre-commencement condition(s) being imposed the application should be refused as it would not comply with NPPF </w:t>
+        <w:t xml:space="preserve">Pre-commencement conditions are necessary to safeguard the archaeological interest on sites. Approval of a WSI before works begin on site provides clarity on what investigations are required, and their timing in relation to the development programme. If the applicant does not agree to a pre-commencement condition please let us know their reasons and any alternatives suggested. Without the recommended pre-commencement condition(s) being imposed the application should be refused as it would not comply with NPPF </w:t>
       </w:r>
       <w:r>
         <w:rPr>
@@ -1097,21 +1089,7 @@
         <w:rPr>
           <w:rFonts w:cstheme="minorHAnsi"/>
         </w:rPr>
-        <w:t xml:space="preserve">This Initial Pre-application advice relates solely to archaeological considerations, is provided without prejudice to the local authority’s decision-making </w:t>
-      </w:r>
-      <w:proofErr w:type="gramStart"/>
-      <w:r>
-        <w:rPr>
-          <w:rFonts w:cstheme="minorHAnsi"/>
-        </w:rPr>
-        <w:t>role, and</w:t>
-      </w:r>
-      <w:proofErr w:type="gramEnd"/>
-      <w:r>
-        <w:rPr>
-          <w:rFonts w:cstheme="minorHAnsi"/>
-        </w:rPr>
-        <w:t xml:space="preserve"> may be shared with the local authority on whose behalf it is given.  You should also consult Historic England’s Development Advice team on statutory matters.</w:t>
+        <w:t>This Initial Pre-application advice relates solely to archaeological considerations, is provided without prejudice to the local authority’s decision-making role, and may be shared with the local authority on whose behalf it is given.  You should also consult Historic England’s Development Advice team on statutory matters.</w:t>
       </w:r>
     </w:p>
     <w:p>
@@ -1262,21 +1240,7 @@
         <w:rPr>
           <w:rFonts w:cstheme="minorHAnsi"/>
         </w:rPr>
-        <w:t xml:space="preserve">London and </w:t>
-      </w:r>
-      <w:proofErr w:type="gramStart"/>
-      <w:r>
-        <w:rPr>
-          <w:rFonts w:cstheme="minorHAnsi"/>
-        </w:rPr>
-        <w:t>South East</w:t>
-      </w:r>
-      <w:proofErr w:type="gramEnd"/>
-      <w:r>
-        <w:rPr>
-          <w:rFonts w:cstheme="minorHAnsi"/>
-        </w:rPr>
-        <w:t xml:space="preserve"> Region</w:t>
+        <w:t>London and South East Region</w:t>
       </w:r>
     </w:p>
     <w:p>
@@ -1531,9 +1495,8 @@
         <w:sz w:val="16"/>
         <w:szCs w:val="16"/>
       </w:rPr>
-      <w:t xml:space="preserve">Historic England, 4th Floor, Cannon Bridge House, 25 </w:t>
+      <w:t>Historic England, 4th Floor, Cannon Bridge House, 25 Dowgate Hill, London EC4R 2YA</w:t>
     </w:r>
-    <w:proofErr w:type="spellStart"/>
     <w:r>
       <w:rPr>
         <w:rFonts w:ascii="Arial" w:hAnsi="Arial"/>
@@ -1542,27 +1505,6 @@
         <w:sz w:val="16"/>
         <w:szCs w:val="16"/>
       </w:rPr>
-      <w:t>Dowgate</w:t>
-    </w:r>
-    <w:proofErr w:type="spellEnd"/>
-    <w:r>
-      <w:rPr>
-        <w:rFonts w:ascii="Arial" w:hAnsi="Arial"/>
-        <w:b/>
-        <w:bCs/>
-        <w:sz w:val="16"/>
-        <w:szCs w:val="16"/>
-      </w:rPr>
-      <w:t xml:space="preserve"> Hill, London EC4R 2YA</w:t>
-    </w:r>
-    <w:r>
-      <w:rPr>
-        <w:rFonts w:ascii="Arial" w:hAnsi="Arial"/>
-        <w:b/>
-        <w:bCs/>
-        <w:sz w:val="16"/>
-        <w:szCs w:val="16"/>
-      </w:rPr>
       <w:br/>
     </w:r>
     <w:r>
@@ -1579,16 +1521,15 @@
         <w:sz w:val="16"/>
         <w:szCs w:val="16"/>
       </w:rPr>
-      <w:t xml:space="preserve">020 7973 </w:t>
+      <w:t>020 7973 3700</w:t>
     </w:r>
-    <w:proofErr w:type="gramStart"/>
     <w:r>
       <w:rPr>
         <w:rFonts w:ascii="Arial" w:hAnsi="Arial"/>
         <w:sz w:val="16"/>
         <w:szCs w:val="16"/>
       </w:rPr>
-      <w:t>3700</w:t>
+      <w:t xml:space="preserve">  </w:t>
     </w:r>
     <w:r>
       <w:rPr>
@@ -1596,24 +1537,7 @@
         <w:sz w:val="16"/>
         <w:szCs w:val="16"/>
       </w:rPr>
-      <w:t xml:space="preserve">  </w:t>
-    </w:r>
-    <w:r>
-      <w:rPr>
-        <w:rFonts w:ascii="Arial" w:hAnsi="Arial"/>
-        <w:sz w:val="16"/>
-        <w:szCs w:val="16"/>
-      </w:rPr>
-      <w:t>|</w:t>
-    </w:r>
-    <w:proofErr w:type="gramEnd"/>
-    <w:r>
-      <w:rPr>
-        <w:rFonts w:ascii="Arial" w:hAnsi="Arial"/>
-        <w:sz w:val="16"/>
-        <w:szCs w:val="16"/>
-      </w:rPr>
-      <w:t xml:space="preserve">  </w:t>
+      <w:t xml:space="preserve">|  </w:t>
     </w:r>
     <w:r>
       <w:rPr>
@@ -3341,6 +3265,10 @@
 </file>
 
 <file path=customXml/item1.xml><?xml version="1.0" encoding="utf-8"?>
+<b:Sources xmlns:b="http://schemas.openxmlformats.org/officeDocument/2006/bibliography" xmlns="http://schemas.openxmlformats.org/officeDocument/2006/bibliography" SelectedStyle="/APASixthEditionOfficeOnline.xsl" StyleName="APA" Version="6"/>
+</file>
+
+<file path=customXml/item2.xml><?xml version="1.0" encoding="utf-8"?>
 <p:properties xmlns:p="http://schemas.microsoft.com/office/2006/metadata/properties" xmlns:xsi="http://www.w3.org/2001/XMLSchema-instance" xmlns:pc="http://schemas.microsoft.com/office/infopath/2007/PartnerControls">
   <documentManagement>
     <lcf76f155ced4ddcb4097134ff3c332f xmlns="e789b7fa-a83c-4c6b-9e01-87c723f67228">
@@ -3351,11 +3279,16 @@
 </p:properties>
 </file>
 
-<file path=customXml/item2.xml><?xml version="1.0" encoding="utf-8"?>
-<b:Sources xmlns:b="http://schemas.openxmlformats.org/officeDocument/2006/bibliography" xmlns="http://schemas.openxmlformats.org/officeDocument/2006/bibliography" SelectedStyle="/APASixthEditionOfficeOnline.xsl" StyleName="APA" Version="6"/>
+<file path=customXml/item3.xml><?xml version="1.0" encoding="utf-8"?>
+<?mso-contentType ?>
+<FormTemplates xmlns="http://schemas.microsoft.com/sharepoint/v3/contenttype/forms">
+  <Display>DocumentLibraryForm</Display>
+  <Edit>DocumentLibraryForm</Edit>
+  <New>DocumentLibraryForm</New>
+</FormTemplates>
 </file>
 
-<file path=customXml/item3.xml><?xml version="1.0" encoding="utf-8"?>
+<file path=customXml/item4.xml><?xml version="1.0" encoding="utf-8"?>
 <ct:contentTypeSchema xmlns:ct="http://schemas.microsoft.com/office/2006/metadata/contentType" xmlns:ma="http://schemas.microsoft.com/office/2006/metadata/properties/metaAttributes" ct:_="" ma:_="" ma:contentTypeName="Document" ma:contentTypeID="0x010100B89331DE8EA64F4FBEA00113BF0E4514" ma:contentTypeVersion="11" ma:contentTypeDescription="Create a new document." ma:contentTypeScope="" ma:versionID="0b60b04e60edb8b2e7e2fe1cc7d413e0">
   <xsd:schema xmlns:xsd="http://www.w3.org/2001/XMLSchema" xmlns:xs="http://www.w3.org/2001/XMLSchema" xmlns:p="http://schemas.microsoft.com/office/2006/metadata/properties" xmlns:ns2="e789b7fa-a83c-4c6b-9e01-87c723f67228" xmlns:ns3="bb952b06-3268-4e55-b0fe-9eb49669fc08" targetNamespace="http://schemas.microsoft.com/office/2006/metadata/properties" ma:root="true" ma:fieldsID="52467e30880403e5f73a15b97b0992c8" ns2:_="" ns3:_="">
     <xsd:import namespace="e789b7fa-a83c-4c6b-9e01-87c723f67228"/>
@@ -3550,16 +3483,15 @@
 </ct:contentTypeSchema>
 </file>
 
-<file path=customXml/item4.xml><?xml version="1.0" encoding="utf-8"?>
-<?mso-contentType ?>
-<FormTemplates xmlns="http://schemas.microsoft.com/sharepoint/v3/contenttype/forms">
-  <Display>DocumentLibraryForm</Display>
-  <Edit>DocumentLibraryForm</Edit>
-  <New>DocumentLibraryForm</New>
-</FormTemplates>
+<file path=customXml/itemProps1.xml><?xml version="1.0" encoding="utf-8"?>
+<ds:datastoreItem xmlns:ds="http://schemas.openxmlformats.org/officeDocument/2006/customXml" ds:itemID="{3B4892E8-18D6-D444-BA6E-299F0B60384F}">
+  <ds:schemaRefs>
+    <ds:schemaRef ds:uri="http://schemas.openxmlformats.org/officeDocument/2006/bibliography"/>
+  </ds:schemaRefs>
+</ds:datastoreItem>
 </file>
 
-<file path=customXml/itemProps1.xml><?xml version="1.0" encoding="utf-8"?>
+<file path=customXml/itemProps2.xml><?xml version="1.0" encoding="utf-8"?>
 <ds:datastoreItem xmlns:ds="http://schemas.openxmlformats.org/officeDocument/2006/customXml" ds:itemID="{EF43FDED-CD1D-4301-B761-71C1DCC851CC}">
   <ds:schemaRefs>
     <ds:schemaRef ds:uri="http://schemas.microsoft.com/office/2006/metadata/properties"/>
@@ -3570,15 +3502,15 @@
 </ds:datastoreItem>
 </file>
 
-<file path=customXml/itemProps2.xml><?xml version="1.0" encoding="utf-8"?>
-<ds:datastoreItem xmlns:ds="http://schemas.openxmlformats.org/officeDocument/2006/customXml" ds:itemID="{3B4892E8-18D6-D444-BA6E-299F0B60384F}">
+<file path=customXml/itemProps3.xml><?xml version="1.0" encoding="utf-8"?>
+<ds:datastoreItem xmlns:ds="http://schemas.openxmlformats.org/officeDocument/2006/customXml" ds:itemID="{45FB1F57-968F-4A6E-AEE9-65961EB5FADD}">
   <ds:schemaRefs>
-    <ds:schemaRef ds:uri="http://schemas.openxmlformats.org/officeDocument/2006/bibliography"/>
+    <ds:schemaRef ds:uri="http://schemas.microsoft.com/sharepoint/v3/contenttype/forms"/>
   </ds:schemaRefs>
 </ds:datastoreItem>
 </file>
 
-<file path=customXml/itemProps3.xml><?xml version="1.0" encoding="utf-8"?>
+<file path=customXml/itemProps4.xml><?xml version="1.0" encoding="utf-8"?>
 <ds:datastoreItem xmlns:ds="http://schemas.openxmlformats.org/officeDocument/2006/customXml" ds:itemID="{93F00A47-6514-4C46-91C6-8D2331E8318E}">
   <ds:schemaRefs>
     <ds:schemaRef ds:uri="http://schemas.microsoft.com/office/2006/metadata/contentType"/>
@@ -3595,12 +3527,4 @@
     <ds:schemaRef ds:uri="http://schemas.microsoft.com/internal/obd"/>
   </ds:schemaRefs>
 </ds:datastoreItem>
-</file>
-
-<file path=customXml/itemProps4.xml><?xml version="1.0" encoding="utf-8"?>
-<ds:datastoreItem xmlns:ds="http://schemas.openxmlformats.org/officeDocument/2006/customXml" ds:itemID="{45FB1F57-968F-4A6E-AEE9-65961EB5FADD}">
-  <ds:schemaRefs>
-    <ds:schemaRef ds:uri="http://schemas.microsoft.com/sharepoint/v3/contenttype/forms"/>
-  </ds:schemaRefs>
-</ds:datastoreItem>
 </file>
</xml_diff>